<commit_message>
chore: strip internal artifacts for public release
- Remove docs/audit-chain/ (18 files): internal multi-instance review
  record, handoff documents, patch ledger, and skeptical-persona
  scaffolding. Preserved locally per Bayyinah Audit Framework
  section 14.5 immutability discipline; not part of the public
  artifact.
- Remove README 'Audit-chain record' section (the stripped
  docs/audit-chain/ tree).
- Strip internal-handoff references from the setup guide docx:
  header byline, internal addressing in 'Open questions' heading,
  internal-deliberation phrasing in the publication open question,
  and the closing 'Notes from' section.

No code, test, or configuration changes. 43/43 tests still pass.

Authored-by: Bilal Syed Arfeen <doctordopemusic@gmail.com>
</commit_message>
<xml_diff>
--- a/docs/Bayyinah-MCP-Server-Setup-Guide.docx
+++ b/docs/Bayyinah-MCP-Server-Setup-Guide.docx
@@ -45,7 +45,7 @@
           <w:sz w:val="20"/>
           <w:szCs w:val="20"/>
         </w:rPr>
-        <w:t xml:space="preserve">Drafted for Bilal Syed Arfeen, BayyinahEnterprise  |  MCP Server v0.1.0</w:t>
+        <w:t>BayyinahEnterprise  |  MCP Server v0.1.0</w:t>
       </w:r>
     </w:p>
     <w:p>
@@ -843,7 +843,7 @@
           <w:b/>
           <w:bCs/>
         </w:rPr>
-        <w:t xml:space="preserve">Open questions for you</w:t>
+        <w:t>Open questions</w:t>
       </w:r>
     </w:p>
     <w:p>
@@ -882,7 +882,7 @@
         <w:spacing w:after="80"/>
       </w:pPr>
       <w:r>
-        <w:t xml:space="preserve">Public publication: ready for PyPI as bayyinah-audit-mcp, or hold for a few internal cycles? PyPI publication makes pip install bayyinah-audit-mcp the install command for any agent maintainer.</w:t>
+        <w:t>Public publication: PyPI publication as bayyinah-audit-mcp makes pip install bayyinah-audit-mcp the install command for any agent maintainer.</w:t>
       </w:r>
     </w:p>
     <w:p>
@@ -981,34 +981,6 @@
       </w:pPr>
       <w:r>
         <w:t xml:space="preserve">Cross-IDE distribution: MCP server (lane #4) makes every primitive callable by any compliant agent without bundling.</w:t>
-      </w:r>
-    </w:p>
-    <w:p>
-      <w:pPr>
-        <w:pStyle w:val="Heading1"/>
-      </w:pPr>
-      <w:r>
-        <w:rPr>
-          <w:b/>
-          <w:bCs/>
-        </w:rPr>
-        <w:t xml:space="preserve">Notes from Pat</w:t>
-      </w:r>
-    </w:p>
-    <w:p>
-      <w:pPr>
-        <w:spacing w:after="120"/>
-      </w:pPr>
-      <w:r>
-        <w:t xml:space="preserve">This is the layer that closes the loop. The other three lanes are useful in isolation, but lane #4 is what makes them composable across every place where an agent might want to invoke the framework. The server itself is small (about 600 lines of Python plus the section index data); the leverage comes from the standard interface.</w:t>
-      </w:r>
-    </w:p>
-    <w:p>
-      <w:pPr>
-        <w:spacing w:after="120"/>
-      </w:pPr>
-      <w:r>
-        <w:t xml:space="preserve">Once the section index is populated and you've registered the server in your own Claude Desktop, the audit framework is a one-tap-away tool in every conversation. From there, the §23.3 'CI into agent layer' path becomes: agent layer everywhere.</w:t>
       </w:r>
     </w:p>
     <w:sectPr>

</xml_diff>